<commit_message>
Batch 5: Ma 18 + Joey 18 - cross-references added
</commit_message>
<xml_diff>
--- a/stories/docx/Joey 18.docx
+++ b/stories/docx/Joey 18.docx
@@ -124,6 +124,14 @@
       </w:pPr>
       <w:r>
         <w:t xml:space="preserve">The Greek thinks we are alone. He is wrong. He has no idea who he is dealing with.</w:t>
+      </w:r>
+    </w:p>
+    <w:p>
+      <w:pPr>
+        <w:pStyle w:val="BodyText"/>
+      </w:pPr>
+      <w:r>
+        <w:t xml:space="preserve">Got a letter from Frank. He mentioned tunnels, someone named Lucia.</w:t>
       </w:r>
     </w:p>
     <w:p>

</xml_diff>